<commit_message>
modelos: caso de uso com extensões, permissões, aceitação e verificação
O modelo de caso de uso passa a trazer os blocos que faltavam: pontos de
extensão declarados, matriz de permissões, critérios de aceitação e
rastreabilidade da verificação. Estava por commitar desde 31 de agosto, e o
sítio publicava a versão anterior.

Os ficheiros .antes — cópias de segurança dos recursos da marca — ficam de
fora do repositório. Agora que é público, não há razão para os mostrar.

Co-Authored-By: Claude Opus 5 (1M context) <noreply@anthropic.com>
Claude-Session: https://claude.ai/code/session_01QazZ6qTjyL3MjfqjsipexC
</commit_message>
<xml_diff>
--- a/02-analise/01-casos-de-uso.docx
+++ b/02-analise/01-casos-de-uso.docx
@@ -507,6 +507,141 @@
       </w:r>
       <w:r>
         <w:t xml:space="preserve">Sobe ao resumo só para enquadrar; desce à sub-função só quando o passo é partilhado por três ou mais casos (senão fica como passo do fluxo principal).</w:t>
+      </w:r>
+    </w:p>
+    <w:p>
+      <w:pPr>
+        <w:pStyle w:val="BodyText"/>
+      </w:pPr>
+      <w:r>
+        <w:rPr>
+          <w:b/>
+          <w:bCs/>
+        </w:rPr>
+        <w:t xml:space="preserve">De onde vem esta metáfora, e porque é que ela ajuda.</w:t>
+      </w:r>
+      <w:r>
+        <w:t xml:space="preserve"> </w:t>
+      </w:r>
+      <w:r>
+        <w:t xml:space="preserve">É de Alistair Cockburn, em</w:t>
+      </w:r>
+      <w:r>
+        <w:t xml:space="preserve"> </w:t>
+      </w:r>
+      <w:r>
+        <w:rPr>
+          <w:i/>
+          <w:iCs/>
+        </w:rPr>
+        <w:t xml:space="preserve">Writing Effective Use Cases</w:t>
+      </w:r>
+      <w:r>
+        <w:t xml:space="preserve"> </w:t>
+      </w:r>
+      <w:r>
+        <w:t xml:space="preserve">(Addison-Wesley, início dos anos 2000), o livro que fixou a forma de escrever casos de uso. A imagem é a de estar acima ou abaixo da linha de água: no original há quatro alturas — papagaio de papel, nível do mar, peixe e</w:t>
+      </w:r>
+      <w:r>
+        <w:t xml:space="preserve"> </w:t>
+      </w:r>
+      <w:r>
+        <w:rPr>
+          <w:b/>
+          <w:bCs/>
+        </w:rPr>
+        <w:t xml:space="preserve">amêijoa</w:t>
+      </w:r>
+      <w:r>
+        <w:t xml:space="preserve">, que é o fundo. A amêijoa fica de fora deste modelo de propósito: é a categoria do que</w:t>
+      </w:r>
+      <w:r>
+        <w:t xml:space="preserve"> </w:t>
+      </w:r>
+      <w:r>
+        <w:rPr>
+          <w:b/>
+          <w:bCs/>
+        </w:rPr>
+        <w:t xml:space="preserve">não</w:t>
+      </w:r>
+      <w:r>
+        <w:t xml:space="preserve"> </w:t>
+      </w:r>
+      <w:r>
+        <w:t xml:space="preserve">se deve escrever, e um modelo não precisa de um nível para isso.</w:t>
+      </w:r>
+    </w:p>
+    <w:p>
+      <w:pPr>
+        <w:pStyle w:val="BodyText"/>
+      </w:pPr>
+      <w:r>
+        <w:t xml:space="preserve">O símbolo é literal.</w:t>
+      </w:r>
+      <w:r>
+        <w:t xml:space="preserve"> </w:t>
+      </w:r>
+      <w:r>
+        <w:rPr>
+          <w:b/>
+          <w:bCs/>
+        </w:rPr>
+        <w:t xml:space="preserve">O peixe está debaixo de água, e a sub-função está debaixo do que o utilizador pediu</w:t>
+      </w:r>
+      <w:r>
+        <w:t xml:space="preserve"> </w:t>
+      </w:r>
+      <w:r>
+        <w:t xml:space="preserve">— ninguém chega ao trabalho de manhã com a intenção de «validar stock». É um passo ao serviço de outra coisa, e é por isso que se liga por</w:t>
+      </w:r>
+      <w:r>
+        <w:t xml:space="preserve"> </w:t>
+      </w:r>
+      <w:r>
+        <w:rPr>
+          <w:rStyle w:val="VerbatimChar"/>
+        </w:rPr>
+        <w:t xml:space="preserve">include</w:t>
+      </w:r>
+      <w:r>
+        <w:t xml:space="preserve"> </w:t>
+      </w:r>
+      <w:r>
+        <w:t xml:space="preserve">ou</w:t>
+      </w:r>
+      <w:r>
+        <w:t xml:space="preserve"> </w:t>
+      </w:r>
+      <w:r>
+        <w:rPr>
+          <w:rStyle w:val="VerbatimChar"/>
+        </w:rPr>
+        <w:t xml:space="preserve">extend</w:t>
+      </w:r>
+      <w:r>
+        <w:t xml:space="preserve"> </w:t>
+      </w:r>
+      <w:r>
+        <w:t xml:space="preserve">em vez de viver sozinho.</w:t>
+      </w:r>
+    </w:p>
+    <w:p>
+      <w:pPr>
+        <w:pStyle w:val="BodyText"/>
+      </w:pPr>
+      <w:r>
+        <w:rPr>
+          <w:b/>
+          <w:bCs/>
+        </w:rPr>
+        <w:t xml:space="preserve">Sem esta distinção acontece sempre uma de duas coisas:</w:t>
+      </w:r>
+      <w:r>
+        <w:t xml:space="preserve"> </w:t>
+      </w:r>
+      <w:r>
+        <w:t xml:space="preserve">ou se escreve um caso gigante que atravessa três departamentos e ninguém consegue verificar, ou se rebenta cada clique num caso próprio e ninguém consegue manter. A altura certa é a do mar — uma pessoa, uma sessão, e um objetivo que ela reconheceria como seu.</w:t>
       </w:r>
     </w:p>
     <w:bookmarkEnd w:id="50"/>

</xml_diff>